<commit_message>
fix(paper-02): 修正Wienke inline引用过度声索 + 生成Word v4
修正：§4.3.1 Wienke句改为"migration-related contextual factors"
（原"linguistic heterogeneity"与§4.3.3两种解释并列的立场自相矛盾）

生成：paper02_draft_v4.docx（1163KB，2表+4图）
- Table 1: 研究特征表（原有）
- Table 2: 神经系统特异性分布（新增，含Maguire跨类脚注+Lange†脚注）

Co-Authored-By: Claude Sonnet 4.6 (1M context) <noreply@anthropic.com>
</commit_message>
<xml_diff>
--- a/projects/paper-02/06-write/老师指导后完善/paper02_draft_v4.docx
+++ b/projects/paper-02/06-write/老师指导后完善/paper02_draft_v4.docx
@@ -75,7 +75,7 @@
           <w:i w:val="0"/>
           <w:sz w:val="24"/>
         </w:rPr>
-        <w:t>To systematically review associations between parental education and neural development in children aged 0–8 years across EEG, ERP, fNIRS, and neuroimaging modalities.</w:t>
+        <w:t>To systematically review associations between parental education and neural development in children aged 0–8 years, examining under what conditions effects are detectable, from what developmental point they emerge, and through what mechanisms they operate.</w:t>
       </w:r>
     </w:p>
     <w:p>
@@ -165,7 +165,7 @@
           <w:i w:val="0"/>
           <w:sz w:val="24"/>
         </w:rPr>
-        <w:t>Higher parental education is associated with more advanced neural development from birth through middle childhood, with convergent evidence across prefrontal and fronto-temporal networks. These findings point to the value of early home enrichment programmes for reducing socioeconomic disparities in neural development.</w:t>
+        <w:t>Higher parental education is associated with more advanced neural development from birth through middle childhood, with effects concentrated in language and executive control networks rather than distributed uniformly across the brain. Three neonatal studies—including one scanning full-term infants within four days of birth—indicate that prenatal mechanisms are a necessary component of the association. Effects were consistent across 15 of 16 mainstream-culture samples; the single exception (a migrant-majority sample) points to cultural and linguistic context as an important moderator requiring further investigation. Whether the association follows a full-range gradient or a deprivation threshold—the central debate in this literature since Noble et al. (2015)—remains unresolved, as no included study tested for non-linear effects. These findings call for neonatal studies with direct biological pathway measurement, pre-registered designs with full-range SES sampling, and studies in non-Western and migrant populations.</w:t>
       </w:r>
     </w:p>
     <w:p>
@@ -363,7 +363,112 @@
           <w:i w:val="0"/>
           <w:sz w:val="24"/>
         </w:rPr>
-        <w:t>The present review addresses these gaps with three aims: (1) to identify studies reporting the independent association between parental education and neural measures in children aged 0–8 years; (2) to synthesize evidence across neural modalities and age windows; and (3) to evaluate candidate mechanisms—cognitive stimulation and chronic stress—supported by the included studies.</w:t>
+        <w:t xml:space="preserve">A landmark study by Noble et al. (2015) in </w:t>
+      </w:r>
+      <w:r>
+        <w:rPr>
+          <w:rFonts w:ascii="Times New Roman" w:hAnsi="Times New Roman"/>
+          <w:b w:val="0"/>
+          <w:i/>
+          <w:sz w:val="24"/>
+        </w:rPr>
+        <w:t>Nature Neuroscience</w:t>
+      </w:r>
+      <w:r>
+        <w:rPr>
+          <w:rFonts w:ascii="Times New Roman" w:hAnsi="Times New Roman"/>
+          <w:b w:val="0"/>
+          <w:i w:val="0"/>
+          <w:sz w:val="24"/>
+        </w:rPr>
+        <w:t xml:space="preserve"> further sharpened the theoretical stakes: reporting that the association between family income and cortical surface area in children and adolescents was markedly non-linear, with the steepest gradient concentrated at the lower end of the income distribution. This deprivation threshold pattern has since become a central point of debate—is the SES–brain association a full-range linear gradient present at every increment of the distribution, or is it concentrated among the most disadvantaged families? This question has not been addressed for parental education specifically in the 0–8 year age range, where the relevant neural indices (EEG power, white matter microstructure, cortical morphometry) differ substantially from those used in Noble et al.'s school-age and adolescent sample.</w:t>
+      </w:r>
+    </w:p>
+    <w:p>
+      <w:pPr>
+        <w:jc w:val="left"/>
+        <w:spacing w:before="0" w:after="120" w:line="480" w:lineRule="auto"/>
+      </w:pPr>
+      <w:r>
+        <w:rPr>
+          <w:rFonts w:ascii="Times New Roman" w:hAnsi="Times New Roman"/>
+          <w:b w:val="0"/>
+          <w:i w:val="0"/>
+          <w:sz w:val="24"/>
+        </w:rPr>
+        <w:t xml:space="preserve">The present review addresses these issues with three questions that go beyond asking </w:t>
+      </w:r>
+      <w:r>
+        <w:rPr>
+          <w:rFonts w:ascii="Times New Roman" w:hAnsi="Times New Roman"/>
+          <w:b w:val="0"/>
+          <w:i/>
+          <w:sz w:val="24"/>
+        </w:rPr>
+        <w:t>whether</w:t>
+      </w:r>
+      <w:r>
+        <w:rPr>
+          <w:rFonts w:ascii="Times New Roman" w:hAnsi="Times New Roman"/>
+          <w:b w:val="0"/>
+          <w:i w:val="0"/>
+          <w:sz w:val="24"/>
+        </w:rPr>
+        <w:t xml:space="preserve"> parental education is associated with neural development: (1) </w:t>
+      </w:r>
+      <w:r>
+        <w:rPr>
+          <w:rFonts w:ascii="Times New Roman" w:hAnsi="Times New Roman"/>
+          <w:b w:val="0"/>
+          <w:i/>
+          <w:sz w:val="24"/>
+        </w:rPr>
+        <w:t>Under what conditions</w:t>
+      </w:r>
+      <w:r>
+        <w:rPr>
+          <w:rFonts w:ascii="Times New Roman" w:hAnsi="Times New Roman"/>
+          <w:b w:val="0"/>
+          <w:i w:val="0"/>
+          <w:sz w:val="24"/>
+        </w:rPr>
+        <w:t xml:space="preserve"> are associations detectable—which neural systems, which developmental windows, and which cultural contexts show the most consistent effects? (2) </w:t>
+      </w:r>
+      <w:r>
+        <w:rPr>
+          <w:rFonts w:ascii="Times New Roman" w:hAnsi="Times New Roman"/>
+          <w:b w:val="0"/>
+          <w:i/>
+          <w:sz w:val="24"/>
+        </w:rPr>
+        <w:t>Through what mechanisms and from what point in development</w:t>
+      </w:r>
+      <w:r>
+        <w:rPr>
+          <w:rFonts w:ascii="Times New Roman" w:hAnsi="Times New Roman"/>
+          <w:b w:val="0"/>
+          <w:i w:val="0"/>
+          <w:sz w:val="24"/>
+        </w:rPr>
+        <w:t xml:space="preserve"> do associations emerge—and what do neonatal findings imply about prenatal versus postnatal pathways? (3) </w:t>
+      </w:r>
+      <w:r>
+        <w:rPr>
+          <w:rFonts w:ascii="Times New Roman" w:hAnsi="Times New Roman"/>
+          <w:b w:val="0"/>
+          <w:i/>
+          <w:sz w:val="24"/>
+        </w:rPr>
+        <w:t>What does the current evidence base leave unresolved</w:t>
+      </w:r>
+      <w:r>
+        <w:rPr>
+          <w:rFonts w:ascii="Times New Roman" w:hAnsi="Times New Roman"/>
+          <w:b w:val="0"/>
+          <w:i w:val="0"/>
+          <w:sz w:val="24"/>
+        </w:rPr>
+        <w:t>—particularly regarding the gradient versus deprivation threshold debate—and what does this imply for future research design?</w:t>
       </w:r>
     </w:p>
     <w:p>
@@ -7291,7 +7396,7 @@
           <w:b/>
           <w:sz w:val="26"/>
         </w:rPr>
-        <w:t>4.3 Cross-modal convergence and neural systems</w:t>
+        <w:t>4.3 Conditions under which associations are detectable: candidate moderators</w:t>
       </w:r>
     </w:p>
     <w:p>
@@ -7306,11 +7411,61 @@
           <w:i w:val="0"/>
           <w:sz w:val="24"/>
         </w:rPr>
-        <w:t>The convergence of parental education associations across frontal and temporal neural systems—regardless of modality—supports a coherent account centered on prefrontal and perisylvian circuitry. In ERP studies, the most consistent finding was greater frontal activation (larger ERN amplitude at fronto-central electrodes) in children of more educated parents. In fNIRS, greater inferior frontal gyrus activation was found. In fMRI, effects clustered in medial prefrontal cortex (amygdala–PFC connectivity; DMN connectivity) and left inferior frontal gyrus (language network). In DTI, the arcuate fasciculus—projecting between inferior frontal and superior temporal cortex—was the most consistently implicated tract. In structural MRI, effects included frontal, parietal, and temporal surface area. Together, these findings converge on a fronto-temporal network encompassing language-processing regions (Broca's area, Wernicke's area, arcuate fasciculus) and executive/affective regulation regions (anterior cingulate, medial prefrontal cortex, DMN).</w:t>
+        <w:t xml:space="preserve">The directional consistency of findings across 16 studies is striking, but the evidence base also reveals systematic variation in </w:t>
+      </w:r>
+      <w:r>
+        <w:rPr>
+          <w:rFonts w:ascii="Times New Roman" w:hAnsi="Times New Roman"/>
+          <w:b w:val="0"/>
+          <w:i/>
+          <w:sz w:val="24"/>
+        </w:rPr>
+        <w:t>where</w:t>
+      </w:r>
+      <w:r>
+        <w:rPr>
+          <w:rFonts w:ascii="Times New Roman" w:hAnsi="Times New Roman"/>
+          <w:b w:val="0"/>
+          <w:i w:val="0"/>
+          <w:sz w:val="24"/>
+        </w:rPr>
+        <w:t xml:space="preserve"> and </w:t>
+      </w:r>
+      <w:r>
+        <w:rPr>
+          <w:rFonts w:ascii="Times New Roman" w:hAnsi="Times New Roman"/>
+          <w:b w:val="0"/>
+          <w:i/>
+          <w:sz w:val="24"/>
+        </w:rPr>
+        <w:t>under what conditions</w:t>
+      </w:r>
+      <w:r>
+        <w:rPr>
+          <w:rFonts w:ascii="Times New Roman" w:hAnsi="Times New Roman"/>
+          <w:b w:val="0"/>
+          <w:i w:val="0"/>
+          <w:sz w:val="24"/>
+        </w:rPr>
+        <w:t xml:space="preserve"> parental education associations with neural development are most reliably observed. Four candidate moderating variables emerge from the current review.</w:t>
       </w:r>
     </w:p>
     <w:p>
       <w:pPr>
+        <w:pStyle w:val="Heading3"/>
+        <w:spacing w:before="160" w:after="40" w:line="360" w:lineRule="auto"/>
+      </w:pPr>
+      <w:r>
+        <w:rPr>
+          <w:rFonts w:ascii="Times New Roman" w:hAnsi="Times New Roman"/>
+          <w:b/>
+          <w:sz w:val="24"/>
+        </w:rPr>
+        <w:t>4.3.1 Neural system specificity</w:t>
+      </w:r>
+    </w:p>
+    <w:p>
+      <w:pPr>
         <w:jc w:val="left"/>
         <w:spacing w:before="0" w:after="120" w:line="480" w:lineRule="auto"/>
       </w:pPr>
@@ -7321,11 +7476,838 @@
           <w:i w:val="0"/>
           <w:sz w:val="24"/>
         </w:rPr>
-        <w:t>This convergence is theoretically coherent: language and executive function are the behavioral domains most consistently linked to parental education in behavioral and developmental studies (Hoff, 2013; Blair &amp; Raver, 2016), and the neural systems implicated here are the substrates of precisely those capacities. The cross-modal evidence thus provides a mechanistically coherent account of how parental education is translated from an environmental input into an outcome measurable at the behavioral level.</w:t>
+        <w:t xml:space="preserve">Parental education effects are not distributed uniformly across the brain. Across modalities, associations cluster in two functional systems: the </w:t>
+      </w:r>
+      <w:r>
+        <w:rPr>
+          <w:rFonts w:ascii="Times New Roman" w:hAnsi="Times New Roman"/>
+          <w:b/>
+          <w:i w:val="0"/>
+          <w:sz w:val="24"/>
+        </w:rPr>
+        <w:t>language network</w:t>
+      </w:r>
+      <w:r>
+        <w:rPr>
+          <w:rFonts w:ascii="Times New Roman" w:hAnsi="Times New Roman"/>
+          <w:b w:val="0"/>
+          <w:i w:val="0"/>
+          <w:sz w:val="24"/>
+        </w:rPr>
+        <w:t xml:space="preserve"> (arcuate fasciculus, inferior frontal gyrus, superior temporal regions) and the </w:t>
+      </w:r>
+      <w:r>
+        <w:rPr>
+          <w:rFonts w:ascii="Times New Roman" w:hAnsi="Times New Roman"/>
+          <w:b/>
+          <w:i w:val="0"/>
+          <w:sz w:val="24"/>
+        </w:rPr>
+        <w:t>executive control and stress-regulation network</w:t>
+      </w:r>
+      <w:r>
+        <w:rPr>
+          <w:rFonts w:ascii="Times New Roman" w:hAnsi="Times New Roman"/>
+          <w:b w:val="0"/>
+          <w:i w:val="0"/>
+          <w:sz w:val="24"/>
+        </w:rPr>
+        <w:t xml:space="preserve"> (anterior cingulate cortex, medial prefrontal cortex, amygdala–PFC circuitry). Seven of 16 studies implicated language-network regions as primary substrates (Turesky et al., 2022; Ozernov-Palchik et al., 2019; Demir-Lira et al., 2021; Brito &amp; Noble, 2020; Shephard et al., 2019; Maguire &amp; Schneider, 2019; Wienke et al., 2024), while five studies implicated prefrontal executive and stress-regulation circuitry (Conejero et al., 2018; Wijeakumar et al., 2019; Ursache &amp; Noble, 2016; Maguire &amp; Schneider, 2019; Ramphal et al., 2020). The remaining four studies (Stiver et al., 2015; McKinnon et al., 2023; Zhu et al., 2023; Lange et al., 2010) reported effects on global or distributed morphometry rather than specific networks. This pattern is not random: language and executive function are precisely the behavioral domains most reliably associated with parental education in the behavioral literature (Hoff, 2013; Blair &amp; Raver, 2016). The neural system specificity thus supports the theoretical coherence of the observed associations, and suggests that future studies focusing on fronto-temporal language circuitry and prefrontal regulatory networks are most likely to detect reliable parental education effects.</w:t>
       </w:r>
     </w:p>
     <w:p>
       <w:pPr>
+        <w:jc w:val="left"/>
+        <w:spacing w:before="0" w:after="120" w:line="480" w:lineRule="auto"/>
+      </w:pPr>
+      <w:r>
+        <w:rPr>
+          <w:rFonts w:ascii="Times New Roman" w:hAnsi="Times New Roman"/>
+          <w:b w:val="0"/>
+          <w:i w:val="0"/>
+          <w:sz w:val="24"/>
+        </w:rPr>
+        <w:t>Among the seven language-network studies, five measured language-circuit anatomy or activation directly (Turesky et al., 2022; Ozernov-Palchik et al., 2019; Demir-Lira et al., 2021; Brito &amp; Noble, 2020; Wienke et al., 2024); two studies (Shephard et al., 2019; Maguire &amp; Schneider, 2019) measured EEG alpha indices that serve as indirect proxies for thalamocortical and prefrontal maturation rather than language-circuit anatomy per se. Wienke et al. (2024), also using an auditory ERP paradigm targeting speech discrimination, produced the review's only negative finding; as discussed in Section 4.3.3, this result most likely reflects migration-related contextual factors specific to that sample rather than the absence of a language-network association per se.</w:t>
+      </w:r>
+    </w:p>
+    <w:p>
+      <w:pPr>
+        <w:jc w:val="left"/>
+        <w:spacing w:before="0" w:after="120" w:line="480" w:lineRule="auto"/>
+      </w:pPr>
+      <w:r>
+        <w:rPr>
+          <w:rFonts w:ascii="Times New Roman" w:hAnsi="Times New Roman"/>
+          <w:b/>
+          <w:i w:val="0"/>
+          <w:sz w:val="24"/>
+        </w:rPr>
+        <w:t>Table 2. Distribution of neural system specificity across 16 included studies</w:t>
+      </w:r>
+    </w:p>
+    <w:tbl>
+      <w:tblPr>
+        <w:tblStyle w:val="TableGrid"/>
+        <w:tblW w:type="auto" w:w="0"/>
+        <w:tblLook w:firstColumn="1" w:firstRow="1" w:lastColumn="0" w:lastRow="0" w:noHBand="0" w:noVBand="1" w:val="04A0"/>
+        <w:tblBorders>
+          <w:top w:val="none" w:sz="0" w:space="0" w:color="auto"/>
+          <w:left w:val="none" w:sz="0" w:space="0" w:color="auto"/>
+          <w:bottom w:val="none" w:sz="0" w:space="0" w:color="auto"/>
+          <w:right w:val="none" w:sz="0" w:space="0" w:color="auto"/>
+          <w:insideH w:val="none" w:sz="0" w:space="0" w:color="auto"/>
+          <w:insideV w:val="none" w:sz="0" w:space="0" w:color="auto"/>
+        </w:tblBorders>
+      </w:tblPr>
+      <w:tblGrid>
+        <w:gridCol w:w="3120"/>
+        <w:gridCol w:w="3120"/>
+        <w:gridCol w:w="3120"/>
+      </w:tblGrid>
+      <w:tr>
+        <w:tc>
+          <w:tcPr>
+            <w:tcW w:type="dxa" w:w="3120"/>
+            <w:tcBorders>
+              <w:top w:val="single" w:sz="12" w:space="0" w:color="000000"/>
+              <w:bottom w:val="single" w:sz="6" w:space="0" w:color="000000"/>
+              <w:left w:val="none" w:sz="0" w:space="0" w:color="auto"/>
+              <w:right w:val="none" w:sz="0" w:space="0" w:color="auto"/>
+              <w:insideH w:val="none" w:sz="0" w:space="0" w:color="auto"/>
+              <w:insideV w:val="none" w:sz="0" w:space="0" w:color="auto"/>
+            </w:tcBorders>
+          </w:tcPr>
+          <w:p>
+            <w:pPr>
+              <w:spacing w:before="0" w:after="0" w:line="276" w:lineRule="auto"/>
+            </w:pPr>
+            <w:r>
+              <w:rPr>
+                <w:rFonts w:ascii="Times New Roman" w:hAnsi="Times New Roman"/>
+                <w:b/>
+                <w:i w:val="0"/>
+                <w:sz w:val="20"/>
+              </w:rPr>
+              <w:t>Neural system</w:t>
+            </w:r>
+          </w:p>
+        </w:tc>
+        <w:tc>
+          <w:tcPr>
+            <w:tcW w:type="dxa" w:w="3120"/>
+            <w:tcBorders>
+              <w:top w:val="single" w:sz="12" w:space="0" w:color="000000"/>
+              <w:bottom w:val="single" w:sz="6" w:space="0" w:color="000000"/>
+              <w:left w:val="none" w:sz="0" w:space="0" w:color="auto"/>
+              <w:right w:val="none" w:sz="0" w:space="0" w:color="auto"/>
+              <w:insideH w:val="none" w:sz="0" w:space="0" w:color="auto"/>
+              <w:insideV w:val="none" w:sz="0" w:space="0" w:color="auto"/>
+            </w:tcBorders>
+          </w:tcPr>
+          <w:p>
+            <w:pPr>
+              <w:spacing w:before="0" w:after="0" w:line="276" w:lineRule="auto"/>
+            </w:pPr>
+            <w:r>
+              <w:rPr>
+                <w:rFonts w:ascii="Times New Roman" w:hAnsi="Times New Roman"/>
+                <w:b w:val="0"/>
+                <w:i/>
+                <w:sz w:val="20"/>
+              </w:rPr>
+              <w:t>k</w:t>
+            </w:r>
+          </w:p>
+        </w:tc>
+        <w:tc>
+          <w:tcPr>
+            <w:tcW w:type="dxa" w:w="3120"/>
+            <w:tcBorders>
+              <w:top w:val="single" w:sz="12" w:space="0" w:color="000000"/>
+              <w:bottom w:val="single" w:sz="6" w:space="0" w:color="000000"/>
+              <w:left w:val="none" w:sz="0" w:space="0" w:color="auto"/>
+              <w:right w:val="none" w:sz="0" w:space="0" w:color="auto"/>
+              <w:insideH w:val="none" w:sz="0" w:space="0" w:color="auto"/>
+              <w:insideV w:val="none" w:sz="0" w:space="0" w:color="auto"/>
+            </w:tcBorders>
+          </w:tcPr>
+          <w:p>
+            <w:pPr>
+              <w:spacing w:before="0" w:after="0" w:line="276" w:lineRule="auto"/>
+            </w:pPr>
+            <w:r>
+              <w:rPr>
+                <w:rFonts w:ascii="Times New Roman" w:hAnsi="Times New Roman"/>
+                <w:b/>
+                <w:i w:val="0"/>
+                <w:sz w:val="20"/>
+              </w:rPr>
+              <w:t>Representative studies</w:t>
+            </w:r>
+          </w:p>
+        </w:tc>
+      </w:tr>
+      <w:tr>
+        <w:tc>
+          <w:tcPr>
+            <w:tcW w:type="dxa" w:w="3120"/>
+            <w:tcBorders>
+              <w:top w:val="none" w:sz="0" w:space="0" w:color="auto"/>
+              <w:bottom w:val="none" w:sz="0" w:space="0" w:color="auto"/>
+              <w:left w:val="none" w:sz="0" w:space="0" w:color="auto"/>
+              <w:right w:val="none" w:sz="0" w:space="0" w:color="auto"/>
+              <w:insideH w:val="none" w:sz="0" w:space="0" w:color="auto"/>
+              <w:insideV w:val="none" w:sz="0" w:space="0" w:color="auto"/>
+            </w:tcBorders>
+          </w:tcPr>
+          <w:p>
+            <w:pPr>
+              <w:spacing w:before="0" w:after="0" w:line="276" w:lineRule="auto"/>
+            </w:pPr>
+            <w:r>
+              <w:rPr>
+                <w:rFonts w:ascii="Times New Roman" w:hAnsi="Times New Roman"/>
+                <w:b w:val="0"/>
+                <w:i w:val="0"/>
+                <w:sz w:val="20"/>
+              </w:rPr>
+              <w:t>Language network (arcuate fasciculus, IFG, STG)</w:t>
+            </w:r>
+          </w:p>
+        </w:tc>
+        <w:tc>
+          <w:tcPr>
+            <w:tcW w:type="dxa" w:w="3120"/>
+            <w:tcBorders>
+              <w:top w:val="none" w:sz="0" w:space="0" w:color="auto"/>
+              <w:bottom w:val="none" w:sz="0" w:space="0" w:color="auto"/>
+              <w:left w:val="none" w:sz="0" w:space="0" w:color="auto"/>
+              <w:right w:val="none" w:sz="0" w:space="0" w:color="auto"/>
+              <w:insideH w:val="none" w:sz="0" w:space="0" w:color="auto"/>
+              <w:insideV w:val="none" w:sz="0" w:space="0" w:color="auto"/>
+            </w:tcBorders>
+          </w:tcPr>
+          <w:p>
+            <w:pPr>
+              <w:spacing w:before="0" w:after="0" w:line="276" w:lineRule="auto"/>
+            </w:pPr>
+            <w:r>
+              <w:rPr>
+                <w:rFonts w:ascii="Times New Roman" w:hAnsi="Times New Roman"/>
+                <w:b w:val="0"/>
+                <w:i w:val="0"/>
+                <w:sz w:val="20"/>
+              </w:rPr>
+              <w:t>7</w:t>
+            </w:r>
+          </w:p>
+        </w:tc>
+        <w:tc>
+          <w:tcPr>
+            <w:tcW w:type="dxa" w:w="3120"/>
+            <w:tcBorders>
+              <w:top w:val="none" w:sz="0" w:space="0" w:color="auto"/>
+              <w:bottom w:val="none" w:sz="0" w:space="0" w:color="auto"/>
+              <w:left w:val="none" w:sz="0" w:space="0" w:color="auto"/>
+              <w:right w:val="none" w:sz="0" w:space="0" w:color="auto"/>
+              <w:insideH w:val="none" w:sz="0" w:space="0" w:color="auto"/>
+              <w:insideV w:val="none" w:sz="0" w:space="0" w:color="auto"/>
+            </w:tcBorders>
+          </w:tcPr>
+          <w:p>
+            <w:pPr>
+              <w:spacing w:before="0" w:after="0" w:line="276" w:lineRule="auto"/>
+            </w:pPr>
+            <w:r>
+              <w:rPr>
+                <w:rFonts w:ascii="Times New Roman" w:hAnsi="Times New Roman"/>
+                <w:b w:val="0"/>
+                <w:i w:val="0"/>
+                <w:sz w:val="20"/>
+              </w:rPr>
+              <w:t>Turesky et al. (2022); Ozernov-Palchik et al. (2019); Demir-Lira et al. (2021)</w:t>
+            </w:r>
+          </w:p>
+        </w:tc>
+      </w:tr>
+      <w:tr>
+        <w:tc>
+          <w:tcPr>
+            <w:tcW w:type="dxa" w:w="3120"/>
+            <w:tcBorders>
+              <w:top w:val="none" w:sz="0" w:space="0" w:color="auto"/>
+              <w:bottom w:val="none" w:sz="0" w:space="0" w:color="auto"/>
+              <w:left w:val="none" w:sz="0" w:space="0" w:color="auto"/>
+              <w:right w:val="none" w:sz="0" w:space="0" w:color="auto"/>
+              <w:insideH w:val="none" w:sz="0" w:space="0" w:color="auto"/>
+              <w:insideV w:val="none" w:sz="0" w:space="0" w:color="auto"/>
+            </w:tcBorders>
+          </w:tcPr>
+          <w:p>
+            <w:pPr>
+              <w:spacing w:before="0" w:after="0" w:line="276" w:lineRule="auto"/>
+            </w:pPr>
+            <w:r>
+              <w:rPr>
+                <w:rFonts w:ascii="Times New Roman" w:hAnsi="Times New Roman"/>
+                <w:b w:val="0"/>
+                <w:i w:val="0"/>
+                <w:sz w:val="20"/>
+              </w:rPr>
+              <w:t>Executive control / stress-regulation (ACC, mPFC, amygdala–PFC)</w:t>
+            </w:r>
+          </w:p>
+        </w:tc>
+        <w:tc>
+          <w:tcPr>
+            <w:tcW w:type="dxa" w:w="3120"/>
+            <w:tcBorders>
+              <w:top w:val="none" w:sz="0" w:space="0" w:color="auto"/>
+              <w:bottom w:val="none" w:sz="0" w:space="0" w:color="auto"/>
+              <w:left w:val="none" w:sz="0" w:space="0" w:color="auto"/>
+              <w:right w:val="none" w:sz="0" w:space="0" w:color="auto"/>
+              <w:insideH w:val="none" w:sz="0" w:space="0" w:color="auto"/>
+              <w:insideV w:val="none" w:sz="0" w:space="0" w:color="auto"/>
+            </w:tcBorders>
+          </w:tcPr>
+          <w:p>
+            <w:pPr>
+              <w:spacing w:before="0" w:after="0" w:line="276" w:lineRule="auto"/>
+            </w:pPr>
+            <w:r>
+              <w:rPr>
+                <w:rFonts w:ascii="Times New Roman" w:hAnsi="Times New Roman"/>
+                <w:b w:val="0"/>
+                <w:i w:val="0"/>
+                <w:sz w:val="20"/>
+              </w:rPr>
+              <w:t>5</w:t>
+            </w:r>
+          </w:p>
+        </w:tc>
+        <w:tc>
+          <w:tcPr>
+            <w:tcW w:type="dxa" w:w="3120"/>
+            <w:tcBorders>
+              <w:top w:val="none" w:sz="0" w:space="0" w:color="auto"/>
+              <w:bottom w:val="none" w:sz="0" w:space="0" w:color="auto"/>
+              <w:left w:val="none" w:sz="0" w:space="0" w:color="auto"/>
+              <w:right w:val="none" w:sz="0" w:space="0" w:color="auto"/>
+              <w:insideH w:val="none" w:sz="0" w:space="0" w:color="auto"/>
+              <w:insideV w:val="none" w:sz="0" w:space="0" w:color="auto"/>
+            </w:tcBorders>
+          </w:tcPr>
+          <w:p>
+            <w:pPr>
+              <w:spacing w:before="0" w:after="0" w:line="276" w:lineRule="auto"/>
+            </w:pPr>
+            <w:r>
+              <w:rPr>
+                <w:rFonts w:ascii="Times New Roman" w:hAnsi="Times New Roman"/>
+                <w:b w:val="0"/>
+                <w:i w:val="0"/>
+                <w:sz w:val="20"/>
+              </w:rPr>
+              <w:t>Conejero et al. (2018); Ramphal et al. (2020); Ursache &amp; Noble (2016)</w:t>
+            </w:r>
+          </w:p>
+        </w:tc>
+      </w:tr>
+      <w:tr>
+        <w:tc>
+          <w:tcPr>
+            <w:tcW w:type="dxa" w:w="3120"/>
+            <w:tcBorders>
+              <w:top w:val="none" w:sz="0" w:space="0" w:color="auto"/>
+              <w:bottom w:val="single" w:sz="12" w:space="0" w:color="000000"/>
+              <w:left w:val="none" w:sz="0" w:space="0" w:color="auto"/>
+              <w:right w:val="none" w:sz="0" w:space="0" w:color="auto"/>
+              <w:insideH w:val="none" w:sz="0" w:space="0" w:color="auto"/>
+              <w:insideV w:val="none" w:sz="0" w:space="0" w:color="auto"/>
+            </w:tcBorders>
+          </w:tcPr>
+          <w:p>
+            <w:pPr>
+              <w:spacing w:before="0" w:after="0" w:line="276" w:lineRule="auto"/>
+            </w:pPr>
+            <w:r>
+              <w:rPr>
+                <w:rFonts w:ascii="Times New Roman" w:hAnsi="Times New Roman"/>
+                <w:b w:val="0"/>
+                <w:i w:val="0"/>
+                <w:sz w:val="20"/>
+              </w:rPr>
+              <w:t>Global / distributed morphometry</w:t>
+            </w:r>
+          </w:p>
+        </w:tc>
+        <w:tc>
+          <w:tcPr>
+            <w:tcW w:type="dxa" w:w="3120"/>
+            <w:tcBorders>
+              <w:top w:val="none" w:sz="0" w:space="0" w:color="auto"/>
+              <w:bottom w:val="single" w:sz="12" w:space="0" w:color="000000"/>
+              <w:left w:val="none" w:sz="0" w:space="0" w:color="auto"/>
+              <w:right w:val="none" w:sz="0" w:space="0" w:color="auto"/>
+              <w:insideH w:val="none" w:sz="0" w:space="0" w:color="auto"/>
+              <w:insideV w:val="none" w:sz="0" w:space="0" w:color="auto"/>
+            </w:tcBorders>
+          </w:tcPr>
+          <w:p>
+            <w:pPr>
+              <w:spacing w:before="0" w:after="0" w:line="276" w:lineRule="auto"/>
+            </w:pPr>
+            <w:r>
+              <w:rPr>
+                <w:rFonts w:ascii="Times New Roman" w:hAnsi="Times New Roman"/>
+                <w:b w:val="0"/>
+                <w:i w:val="0"/>
+                <w:sz w:val="20"/>
+              </w:rPr>
+              <w:t>4</w:t>
+            </w:r>
+          </w:p>
+        </w:tc>
+        <w:tc>
+          <w:tcPr>
+            <w:tcW w:type="dxa" w:w="3120"/>
+            <w:tcBorders>
+              <w:top w:val="none" w:sz="0" w:space="0" w:color="auto"/>
+              <w:bottom w:val="single" w:sz="12" w:space="0" w:color="000000"/>
+              <w:left w:val="none" w:sz="0" w:space="0" w:color="auto"/>
+              <w:right w:val="none" w:sz="0" w:space="0" w:color="auto"/>
+              <w:insideH w:val="none" w:sz="0" w:space="0" w:color="auto"/>
+              <w:insideV w:val="none" w:sz="0" w:space="0" w:color="auto"/>
+            </w:tcBorders>
+          </w:tcPr>
+          <w:p>
+            <w:pPr>
+              <w:spacing w:before="0" w:after="0" w:line="276" w:lineRule="auto"/>
+            </w:pPr>
+            <w:r>
+              <w:rPr>
+                <w:rFonts w:ascii="Times New Roman" w:hAnsi="Times New Roman"/>
+                <w:b w:val="0"/>
+                <w:i w:val="0"/>
+                <w:sz w:val="20"/>
+              </w:rPr>
+              <w:t>McKinnon et al. (2023); Zhu et al. (2023); Stiver et al. (2015); Lange et al. (2010)†</w:t>
+            </w:r>
+          </w:p>
+        </w:tc>
+      </w:tr>
+    </w:tbl>
+    <w:p/>
+    <w:p>
+      <w:pPr>
+        <w:jc w:val="left"/>
+        <w:spacing w:before="0" w:after="120" w:line="480" w:lineRule="auto"/>
+      </w:pPr>
+      <w:r>
+        <w:rPr>
+          <w:rFonts w:ascii="Times New Roman" w:hAnsi="Times New Roman"/>
+          <w:b/>
+          <w:i/>
+          <w:sz w:val="20"/>
+        </w:rPr>
+        <w:t>Note.</w:t>
+      </w:r>
+      <w:r>
+        <w:rPr>
+          <w:rFonts w:ascii="Times New Roman" w:hAnsi="Times New Roman"/>
+          <w:b w:val="0"/>
+          <w:i w:val="0"/>
+          <w:sz w:val="20"/>
+        </w:rPr>
+        <w:t xml:space="preserve"> Maguire &amp; Schneider (2019) contributed to both the language network and executive control counts (alpha power as language-maturation proxy; vocabulary and working memory as executive outcomes); total </w:t>
+      </w:r>
+      <w:r>
+        <w:rPr>
+          <w:rFonts w:ascii="Times New Roman" w:hAnsi="Times New Roman"/>
+          <w:b w:val="0"/>
+          <w:i/>
+          <w:sz w:val="20"/>
+        </w:rPr>
+        <w:t>k</w:t>
+      </w:r>
+      <w:r>
+        <w:rPr>
+          <w:rFonts w:ascii="Times New Roman" w:hAnsi="Times New Roman"/>
+          <w:b w:val="0"/>
+          <w:i w:val="0"/>
+          <w:sz w:val="20"/>
+        </w:rPr>
+        <w:t xml:space="preserve"> across categories therefore exceeds 16. †Lange et al. (2010) used brain volume as a covariate rather than a primary neural outcome; the primary reported finding was an association between parental education and verbal IQ.</w:t>
+      </w:r>
+    </w:p>
+    <w:p>
+      <w:pPr>
+        <w:pStyle w:val="Heading3"/>
+        <w:spacing w:before="160" w:after="40" w:line="360" w:lineRule="auto"/>
+      </w:pPr>
+      <w:r>
+        <w:rPr>
+          <w:rFonts w:ascii="Times New Roman" w:hAnsi="Times New Roman"/>
+          <w:b/>
+          <w:sz w:val="24"/>
+        </w:rPr>
+        <w:t>4.3.2 Developmental age</w:t>
+      </w:r>
+    </w:p>
+    <w:p>
+      <w:pPr>
+        <w:jc w:val="left"/>
+        <w:spacing w:before="0" w:after="120" w:line="480" w:lineRule="auto"/>
+      </w:pPr>
+      <w:r>
+        <w:rPr>
+          <w:rFonts w:ascii="Times New Roman" w:hAnsi="Times New Roman"/>
+          <w:b w:val="0"/>
+          <w:i w:val="0"/>
+          <w:sz w:val="24"/>
+        </w:rPr>
+        <w:t>The evidence reviewed here provides no support for the hypothesis that parental education effects on neural development are restricted to a particular sensitive period. Positive associations were observed across all developmental windows sampled: neonatal period (</w:t>
+      </w:r>
+      <w:r>
+        <w:rPr>
+          <w:rFonts w:ascii="Times New Roman" w:hAnsi="Times New Roman"/>
+          <w:b w:val="0"/>
+          <w:i/>
+          <w:sz w:val="24"/>
+        </w:rPr>
+        <w:t>k</w:t>
+      </w:r>
+      <w:r>
+        <w:rPr>
+          <w:rFonts w:ascii="Times New Roman" w:hAnsi="Times New Roman"/>
+          <w:b w:val="0"/>
+          <w:i w:val="0"/>
+          <w:sz w:val="24"/>
+        </w:rPr>
+        <w:t xml:space="preserve"> = 3), infancy 1–12 months (</w:t>
+      </w:r>
+      <w:r>
+        <w:rPr>
+          <w:rFonts w:ascii="Times New Roman" w:hAnsi="Times New Roman"/>
+          <w:b w:val="0"/>
+          <w:i/>
+          <w:sz w:val="24"/>
+        </w:rPr>
+        <w:t>k</w:t>
+      </w:r>
+      <w:r>
+        <w:rPr>
+          <w:rFonts w:ascii="Times New Roman" w:hAnsi="Times New Roman"/>
+          <w:b w:val="0"/>
+          <w:i w:val="0"/>
+          <w:sz w:val="24"/>
+        </w:rPr>
+        <w:t xml:space="preserve"> = 4), toddler period 1–3 years (</w:t>
+      </w:r>
+      <w:r>
+        <w:rPr>
+          <w:rFonts w:ascii="Times New Roman" w:hAnsi="Times New Roman"/>
+          <w:b w:val="0"/>
+          <w:i/>
+          <w:sz w:val="24"/>
+        </w:rPr>
+        <w:t>k</w:t>
+      </w:r>
+      <w:r>
+        <w:rPr>
+          <w:rFonts w:ascii="Times New Roman" w:hAnsi="Times New Roman"/>
+          <w:b w:val="0"/>
+          <w:i w:val="0"/>
+          <w:sz w:val="24"/>
+        </w:rPr>
+        <w:t xml:space="preserve"> = 2), preschool and early school-age 5–8 years (</w:t>
+      </w:r>
+      <w:r>
+        <w:rPr>
+          <w:rFonts w:ascii="Times New Roman" w:hAnsi="Times New Roman"/>
+          <w:b w:val="0"/>
+          <w:i/>
+          <w:sz w:val="24"/>
+        </w:rPr>
+        <w:t>k</w:t>
+      </w:r>
+      <w:r>
+        <w:rPr>
+          <w:rFonts w:ascii="Times New Roman" w:hAnsi="Times New Roman"/>
+          <w:b w:val="0"/>
+          <w:i w:val="0"/>
+          <w:sz w:val="24"/>
+        </w:rPr>
+        <w:t xml:space="preserve"> = 4), and school-age extending beyond 8 years (</w:t>
+      </w:r>
+      <w:r>
+        <w:rPr>
+          <w:rFonts w:ascii="Times New Roman" w:hAnsi="Times New Roman"/>
+          <w:b w:val="0"/>
+          <w:i/>
+          <w:sz w:val="24"/>
+        </w:rPr>
+        <w:t>k</w:t>
+      </w:r>
+      <w:r>
+        <w:rPr>
+          <w:rFonts w:ascii="Times New Roman" w:hAnsi="Times New Roman"/>
+          <w:b w:val="0"/>
+          <w:i w:val="0"/>
+          <w:sz w:val="24"/>
+        </w:rPr>
+        <w:t xml:space="preserve"> = 3). The absence of a developmental window in which effects are absent is itself informative: it implies that the environmental inputs associated with parental education—prenatal stress exposure, postnatal language input, caregiving quality—exert continuous rather than stage-specific influence on the developing brain. Whether effects are </w:t>
+      </w:r>
+      <w:r>
+        <w:rPr>
+          <w:rFonts w:ascii="Times New Roman" w:hAnsi="Times New Roman"/>
+          <w:b w:val="0"/>
+          <w:i/>
+          <w:sz w:val="24"/>
+        </w:rPr>
+        <w:t>larger</w:t>
+      </w:r>
+      <w:r>
+        <w:rPr>
+          <w:rFonts w:ascii="Times New Roman" w:hAnsi="Times New Roman"/>
+          <w:b w:val="0"/>
+          <w:i w:val="0"/>
+          <w:sz w:val="24"/>
+        </w:rPr>
+        <w:t xml:space="preserve"> at particular developmental windows cannot be determined from the current evidence base, given that studies across age groups used incommensurable neural outcomes and modalities. Addressing this question will require longitudinal designs that track the same neural indices across multiple developmental stages.</w:t>
+      </w:r>
+    </w:p>
+    <w:p>
+      <w:pPr>
+        <w:pStyle w:val="Heading3"/>
+        <w:spacing w:before="160" w:after="40" w:line="360" w:lineRule="auto"/>
+      </w:pPr>
+      <w:r>
+        <w:rPr>
+          <w:rFonts w:ascii="Times New Roman" w:hAnsi="Times New Roman"/>
+          <w:b/>
+          <w:sz w:val="24"/>
+        </w:rPr>
+        <w:t>4.3.3 Cultural and migration context: the Wienke exception</w:t>
+      </w:r>
+    </w:p>
+    <w:p>
+      <w:pPr>
+        <w:jc w:val="left"/>
+        <w:spacing w:before="0" w:after="120" w:line="480" w:lineRule="auto"/>
+      </w:pPr>
+      <w:r>
+        <w:rPr>
+          <w:rFonts w:ascii="Times New Roman" w:hAnsi="Times New Roman"/>
+          <w:b w:val="0"/>
+          <w:i w:val="0"/>
+          <w:sz w:val="24"/>
+        </w:rPr>
+        <w:t>The single negative finding in this review—Wienke et al. (2024), reporting reduced ERP differentiation in infants of lower-educated parents in a German sample—warrants specific attention as a potential moderator. Wienke's sample was predominantly composed of migrant families, in whom parental education level may carry different meaning than in the majority-culture samples that constitute the remaining 15 studies. Two competing explanations deserve consideration.</w:t>
+      </w:r>
+    </w:p>
+    <w:p>
+      <w:pPr>
+        <w:jc w:val="left"/>
+        <w:spacing w:before="0" w:after="120" w:line="480" w:lineRule="auto"/>
+      </w:pPr>
+      <w:r>
+        <w:rPr>
+          <w:rFonts w:ascii="Times New Roman" w:hAnsi="Times New Roman"/>
+          <w:b w:val="0"/>
+          <w:i w:val="0"/>
+          <w:sz w:val="24"/>
+        </w:rPr>
+        <w:t xml:space="preserve">The first is </w:t>
+      </w:r>
+      <w:r>
+        <w:rPr>
+          <w:rFonts w:ascii="Times New Roman" w:hAnsi="Times New Roman"/>
+          <w:b/>
+          <w:i w:val="0"/>
+          <w:sz w:val="24"/>
+        </w:rPr>
+        <w:t>educational credential devaluation</w:t>
+      </w:r>
+      <w:r>
+        <w:rPr>
+          <w:rFonts w:ascii="Times New Roman" w:hAnsi="Times New Roman"/>
+          <w:b w:val="0"/>
+          <w:i w:val="0"/>
+          <w:sz w:val="24"/>
+        </w:rPr>
+        <w:t xml:space="preserve">: in migrant contexts, formal educational qualifications obtained abroad are frequently not recognized by host-country institutions and labour markets, meaning that the educational resources a parent actually possesses—including language proficiency, cultural capital, and occupational resources—may not correspond to their years of schooling in the way they would in the country where education was obtained. If the mechanism linking parental education to neural development operates through the </w:t>
+      </w:r>
+      <w:r>
+        <w:rPr>
+          <w:rFonts w:ascii="Times New Roman" w:hAnsi="Times New Roman"/>
+          <w:b w:val="0"/>
+          <w:i/>
+          <w:sz w:val="24"/>
+        </w:rPr>
+        <w:t>quality of the home learning environment</w:t>
+      </w:r>
+      <w:r>
+        <w:rPr>
+          <w:rFonts w:ascii="Times New Roman" w:hAnsi="Times New Roman"/>
+          <w:b w:val="0"/>
+          <w:i w:val="0"/>
+          <w:sz w:val="24"/>
+        </w:rPr>
+        <w:t xml:space="preserve"> rather than through years of schooling per se, then devaluation of educational credentials in migrant families would attenuate or reverse the expected association.</w:t>
+      </w:r>
+    </w:p>
+    <w:p>
+      <w:pPr>
+        <w:jc w:val="left"/>
+        <w:spacing w:before="0" w:after="120" w:line="480" w:lineRule="auto"/>
+      </w:pPr>
+      <w:r>
+        <w:rPr>
+          <w:rFonts w:ascii="Times New Roman" w:hAnsi="Times New Roman"/>
+          <w:b w:val="0"/>
+          <w:i w:val="0"/>
+          <w:sz w:val="24"/>
+        </w:rPr>
+        <w:t xml:space="preserve">The second is </w:t>
+      </w:r>
+      <w:r>
+        <w:rPr>
+          <w:rFonts w:ascii="Times New Roman" w:hAnsi="Times New Roman"/>
+          <w:b/>
+          <w:i w:val="0"/>
+          <w:sz w:val="24"/>
+        </w:rPr>
+        <w:t>multilingual input heterogeneity</w:t>
+      </w:r>
+      <w:r>
+        <w:rPr>
+          <w:rFonts w:ascii="Times New Roman" w:hAnsi="Times New Roman"/>
+          <w:b w:val="0"/>
+          <w:i w:val="0"/>
+          <w:sz w:val="24"/>
+        </w:rPr>
+        <w:t>: infants in multilingual households receive phonological input from multiple language systems, which may produce neural differentiation patterns in auditory processing paradigms that differ from those observed in monolingual majority-language infants. In the Wienke paradigm specifically—an auditory oddball paradigm using German speech stimuli—infants whose primary home language was not German may show reduced differentiation of German-specific phonemic contrasts irrespective of parental education level, confounding the education effect.</w:t>
+      </w:r>
+    </w:p>
+    <w:p>
+      <w:pPr>
+        <w:jc w:val="left"/>
+        <w:spacing w:before="0" w:after="120" w:line="480" w:lineRule="auto"/>
+      </w:pPr>
+      <w:r>
+        <w:rPr>
+          <w:rFonts w:ascii="Times New Roman" w:hAnsi="Times New Roman"/>
+          <w:b w:val="0"/>
+          <w:i w:val="0"/>
+          <w:sz w:val="24"/>
+        </w:rPr>
+        <w:t>These two explanations cannot be disentangled with the available data, as Wienke et al. (2024) did not separately analyse the migrant sub-sample or report language-of-testing breakdowns by education group. However, both explanations converge on the same prediction: the association between parental education and neural development may be substantially moderated by whether the family belongs to the cultural and linguistic mainstream of the society in which the study is conducted. This hypothesis is directly testable in future studies using stratified analyses by migration status and home language environment, and has important implications for the generalizability of findings from predominantly majority-culture, English-speaking samples to the global population.</w:t>
+      </w:r>
+    </w:p>
+    <w:p>
+      <w:pPr>
+        <w:pStyle w:val="Heading3"/>
+        <w:spacing w:before="160" w:after="40" w:line="360" w:lineRule="auto"/>
+      </w:pPr>
+      <w:r>
+        <w:rPr>
+          <w:rFonts w:ascii="Times New Roman" w:hAnsi="Times New Roman"/>
+          <w:b/>
+          <w:sz w:val="24"/>
+        </w:rPr>
+        <w:t>4.3.4 Operationalization of parental education</w:t>
+      </w:r>
+    </w:p>
+    <w:p>
+      <w:pPr>
+        <w:jc w:val="left"/>
+        <w:spacing w:before="0" w:after="120" w:line="480" w:lineRule="auto"/>
+      </w:pPr>
+      <w:r>
+        <w:rPr>
+          <w:rFonts w:ascii="Times New Roman" w:hAnsi="Times New Roman"/>
+          <w:b w:val="0"/>
+          <w:i w:val="0"/>
+          <w:sz w:val="24"/>
+        </w:rPr>
+        <w:t>A potential methodological moderator is how parental education was measured. Across 16 studies, education was operationalized as continuous years of schooling (</w:t>
+      </w:r>
+      <w:r>
+        <w:rPr>
+          <w:rFonts w:ascii="Times New Roman" w:hAnsi="Times New Roman"/>
+          <w:b w:val="0"/>
+          <w:i/>
+          <w:sz w:val="24"/>
+        </w:rPr>
+        <w:t>k</w:t>
+      </w:r>
+      <w:r>
+        <w:rPr>
+          <w:rFonts w:ascii="Times New Roman" w:hAnsi="Times New Roman"/>
+          <w:b w:val="0"/>
+          <w:i w:val="0"/>
+          <w:sz w:val="24"/>
+        </w:rPr>
+        <w:t xml:space="preserve"> = 9), categorical degree attainment (</w:t>
+      </w:r>
+      <w:r>
+        <w:rPr>
+          <w:rFonts w:ascii="Times New Roman" w:hAnsi="Times New Roman"/>
+          <w:b w:val="0"/>
+          <w:i/>
+          <w:sz w:val="24"/>
+        </w:rPr>
+        <w:t>k</w:t>
+      </w:r>
+      <w:r>
+        <w:rPr>
+          <w:rFonts w:ascii="Times New Roman" w:hAnsi="Times New Roman"/>
+          <w:b w:val="0"/>
+          <w:i w:val="0"/>
+          <w:sz w:val="24"/>
+        </w:rPr>
+        <w:t xml:space="preserve"> = 5), or composite-separable (</w:t>
+      </w:r>
+      <w:r>
+        <w:rPr>
+          <w:rFonts w:ascii="Times New Roman" w:hAnsi="Times New Roman"/>
+          <w:b w:val="0"/>
+          <w:i/>
+          <w:sz w:val="24"/>
+        </w:rPr>
+        <w:t>k</w:t>
+      </w:r>
+      <w:r>
+        <w:rPr>
+          <w:rFonts w:ascii="Times New Roman" w:hAnsi="Times New Roman"/>
+          <w:b w:val="0"/>
+          <w:i w:val="0"/>
+          <w:sz w:val="24"/>
+        </w:rPr>
+        <w:t xml:space="preserve"> = 7, with some overlap). Both positive findings and the single negative finding were distributed across operationalization types, suggesting that the direction of the association does not depend on measurement format. However, the </w:t>
+      </w:r>
+      <w:r>
+        <w:rPr>
+          <w:rFonts w:ascii="Times New Roman" w:hAnsi="Times New Roman"/>
+          <w:b w:val="0"/>
+          <w:i/>
+          <w:sz w:val="24"/>
+        </w:rPr>
+        <w:t>magnitude</w:t>
+      </w:r>
+      <w:r>
+        <w:rPr>
+          <w:rFonts w:ascii="Times New Roman" w:hAnsi="Times New Roman"/>
+          <w:b w:val="0"/>
+          <w:i w:val="0"/>
+          <w:sz w:val="24"/>
+        </w:rPr>
+        <w:t xml:space="preserve"> of associations may vary: continuous operationalizations can detect gradients across the full distribution, whereas binary categorizations (e.g., university degree vs. lower) necessarily focus on a single threshold. As discussed in Section 4.3 above, distinguishing gradient from threshold effects is a priority for future research, and will require designs that preserve continuous variation across the full education distribution.</w:t>
+      </w:r>
+    </w:p>
+    <w:p>
+      <w:pPr>
         <w:pStyle w:val="Heading2"/>
         <w:spacing w:before="200" w:after="40" w:line="360" w:lineRule="auto"/>
       </w:pPr>
@@ -7335,11 +8317,25 @@
           <w:b/>
           <w:sz w:val="26"/>
         </w:rPr>
-        <w:t>4.4 Limitations and future directions</w:t>
+        <w:t>4.4 Mechanistic pathways: what the evidence constrains</w:t>
       </w:r>
     </w:p>
     <w:p>
       <w:pPr>
+        <w:pStyle w:val="Heading3"/>
+        <w:spacing w:before="160" w:after="40" w:line="360" w:lineRule="auto"/>
+      </w:pPr>
+      <w:r>
+        <w:rPr>
+          <w:rFonts w:ascii="Times New Roman" w:hAnsi="Times New Roman"/>
+          <w:b/>
+          <w:sz w:val="24"/>
+        </w:rPr>
+        <w:t>4.3.1 The only direct mediation test</w:t>
+      </w:r>
+    </w:p>
+    <w:p>
+      <w:pPr>
         <w:jc w:val="left"/>
         <w:spacing w:before="0" w:after="120" w:line="480" w:lineRule="auto"/>
       </w:pPr>
@@ -7350,11 +8346,25 @@
           <w:i w:val="0"/>
           <w:sz w:val="24"/>
         </w:rPr>
-        <w:t>Several limitations of the reviewed evidence base warrant explicit acknowledgment.</w:t>
+        <w:t>Among the 16 included studies, Ursache &amp; Noble (2016) uniquely tested a direct mediation pathway, demonstrating that white matter microstructure in frontoparietal tracts partially mediated the association between parental education and executive function performance. This constitutes the only direct neural mechanism evidence in the current evidence base; all other mechanistic accounts remain inferential from indirect evidence.</w:t>
       </w:r>
     </w:p>
     <w:p>
       <w:pPr>
+        <w:pStyle w:val="Heading3"/>
+        <w:spacing w:before="160" w:after="40" w:line="360" w:lineRule="auto"/>
+      </w:pPr>
+      <w:r>
+        <w:rPr>
+          <w:rFonts w:ascii="Times New Roman" w:hAnsi="Times New Roman"/>
+          <w:b/>
+          <w:sz w:val="24"/>
+        </w:rPr>
+        <w:t>4.3.2 Prenatal mechanisms are a necessary component</w:t>
+      </w:r>
+    </w:p>
+    <w:p>
+      <w:pPr>
         <w:jc w:val="left"/>
         <w:spacing w:before="0" w:after="120" w:line="480" w:lineRule="auto"/>
       </w:pPr>
@@ -7365,11 +8375,25 @@
           <w:i w:val="0"/>
           <w:sz w:val="24"/>
         </w:rPr>
-        <w:t>The most variable feature across studies was how parental education was measured. Across 16 studies, parental education was operationalized in at least six distinct ways (maternal years, paternal years, mean parental years, highest parental level, binary degree attainment, composite-separable). Notably, 14 of 16 studies relied primarily on maternal education; only two studies used highest-parental or combined-parental measures. The theoretical mechanisms proposed in this review—language input quality, caregiver sensitivity, stress buffering—differ systematically for maternal versus paternal education, and it remains unclear whether paternal education confers independent neural advantages beyond those associated with maternal education. Conclusions should therefore be read primarily as reflecting associations with maternal educational attainment. This heterogeneity also limits the precision of conclusions about dose–response relationships and makes it impossible to determine whether specific thresholds of educational attainment (e.g., university degree) confer qualitatively different advantages than incremental differences within lower educational levels.</w:t>
+        <w:t>Three studies measured neural outcomes in the neonatal period, prior to the accumulation of substantial postnatal environmental experience. Most directly, Ramphal et al. (2020) detected parental education associations with amygdala–prefrontal functional connectivity in full-term neonates scanned within four days of birth—a window too brief for postnatal language or caregiving inputs to have shaped functional brain connectivity, implying that fetal programming is a necessary component of the observed association. McKinnon et al. (2023) and Konrad et al. (2024), while measuring at term-equivalent age after several weeks of postnatal NICU care, converge on the same conclusion: parental education leaves a detectable neural signature before the child has accumulated meaningful independent learning experience. Together, these neonatal findings constrain the mechanistic account: cognitive stimulation and language input pathways can explain post-birth associations, but cannot account for differences already present at birth. Prenatal exposure mechanisms—including gestational stress, fetal cortisol exposure, and nutritional differences—are therefore necessary rather than optional components of any complete mechanistic model.</w:t>
       </w:r>
     </w:p>
     <w:p>
       <w:pPr>
+        <w:pStyle w:val="Heading3"/>
+        <w:spacing w:before="160" w:after="40" w:line="360" w:lineRule="auto"/>
+      </w:pPr>
+      <w:r>
+        <w:rPr>
+          <w:rFonts w:ascii="Times New Roman" w:hAnsi="Times New Roman"/>
+          <w:b/>
+          <w:sz w:val="24"/>
+        </w:rPr>
+        <w:t>4.3.3 The gradient versus threshold question remains unresolved</w:t>
+      </w:r>
+    </w:p>
+    <w:p>
+      <w:pPr>
         <w:jc w:val="left"/>
         <w:spacing w:before="0" w:after="120" w:line="480" w:lineRule="auto"/>
       </w:pPr>
@@ -7380,11 +8404,25 @@
           <w:i w:val="0"/>
           <w:sz w:val="24"/>
         </w:rPr>
-        <w:t>No included study directly measured the hypothesized mediating variables alongside neural outcomes. As noted in Section 3.6, the mechanistic pathways proposed—cognitive stimulation and stress reduction—remain inferential from indirect evidence. Specifically designed studies coupling home language environment measurement (e.g., LENA recording; Gilkerson et al., 2017), caregiver stress biomarkers, and longitudinal neural assessment are needed to formally test the mechanistic chains.</w:t>
+        <w:t>A central theoretical question in this literature, raised prominently by Noble et al. (2015) in a large structural MRI study, is whether the association between SES and brain development follows a full-range linear gradient—with advantages accruing at every increment of the education distribution—or whether effects are concentrated at the lower end, reflecting a deprivation threshold below which neural development is compromised. No included study in the present review directly tested for non-linear effects; all 16 studies modelled parental education as a continuous linear predictor or as a simple categorical comparison. Whether the education–neural development association follows a gradient or a deprivation threshold therefore remains unresolved at the neural level for the 0–8 year age range. Notably, two studies—Brito &amp; Noble (2020) and Ozernov-Palchik et al. (2019)—drew from samples spanning the full SES range and reported effects that persisted across the distribution, offering weak support for the gradient model; however, neither explicitly tested non-linearity. Resolving this question requires studies that either oversample low-education families or explicitly model polynomial or spline terms in the education–brain relationship. This represents perhaps the most important unresolved theoretical question in the literature reviewed here.</w:t>
       </w:r>
     </w:p>
     <w:p>
       <w:pPr>
+        <w:pStyle w:val="Heading2"/>
+        <w:spacing w:before="200" w:after="40" w:line="360" w:lineRule="auto"/>
+      </w:pPr>
+      <w:r>
+        <w:rPr>
+          <w:rFonts w:ascii="Times New Roman" w:hAnsi="Times New Roman"/>
+          <w:b/>
+          <w:sz w:val="26"/>
+        </w:rPr>
+        <w:t>4.4 Cross-modal convergence and neural systems</w:t>
+      </w:r>
+    </w:p>
+    <w:p>
+      <w:pPr>
         <w:jc w:val="left"/>
         <w:spacing w:before="0" w:after="120" w:line="480" w:lineRule="auto"/>
       </w:pPr>
@@ -7395,7 +8433,7 @@
           <w:i w:val="0"/>
           <w:sz w:val="24"/>
         </w:rPr>
-        <w:t>Geographic and cultural concentration is a further limitation. Despite spanning 10 countries, the included studies are heavily concentrated in high-income Western contexts, particularly the United States, United Kingdom, and Canada (10 of 16 studies). Only one study (Wijeakumar et al., 2019) included a sample from a low- or middle-income country, and its cross-cultural design precluded direct inference about non-Western contexts in isolation. The systematic search was also restricted to English-language publications, further limiting coverage of research published in other languages, including Chinese, which would be essential for capturing the substantial and growing neurodevelopmental literature from China. The generalizability of findings to non-Western, non-English-speaking, and low-income country contexts is therefore unknown, and should not be assumed.</w:t>
+        <w:t>The convergence of parental education associations across frontal and temporal neural systems—regardless of modality—supports a coherent account centered on prefrontal and perisylvian circuitry. In ERP studies, the most consistent finding was greater frontal activation (larger ERN amplitude at fronto-central electrodes) in children of more educated parents. In fNIRS, greater inferior frontal gyrus activation was found. In fMRI, effects clustered in medial prefrontal cortex (amygdala–PFC connectivity; DMN connectivity) and left inferior frontal gyrus (language network). In DTI, the arcuate fasciculus—projecting between inferior frontal and superior temporal cortex—was the most consistently implicated tract. In structural MRI, effects included frontal, parietal, and temporal surface area. Together, these findings converge on a fronto-temporal network encompassing language-processing regions (Broca's area, Wernicke's area, arcuate fasciculus) and executive/affective regulation regions (anterior cingulate, medial prefrontal cortex, DMN).</w:t>
       </w:r>
     </w:p>
     <w:p>
@@ -7410,65 +8448,25 @@
           <w:i w:val="0"/>
           <w:sz w:val="24"/>
         </w:rPr>
-        <w:t xml:space="preserve">Several included studies had samples of fewer than 50 children (Stiver et al., 2015, </w:t>
-      </w:r>
-      <w:r>
-        <w:rPr>
-          <w:rFonts w:ascii="Times New Roman" w:hAnsi="Times New Roman"/>
-          <w:b w:val="0"/>
-          <w:i/>
-          <w:sz w:val="24"/>
-        </w:rPr>
-        <w:t>N</w:t>
-      </w:r>
-      <w:r>
-        <w:rPr>
-          <w:rFonts w:ascii="Times New Roman" w:hAnsi="Times New Roman"/>
-          <w:b w:val="0"/>
-          <w:i w:val="0"/>
-          <w:sz w:val="24"/>
-        </w:rPr>
-        <w:t xml:space="preserve"> = 26; Wijeakumar et al., 2019, </w:t>
-      </w:r>
-      <w:r>
-        <w:rPr>
-          <w:rFonts w:ascii="Times New Roman" w:hAnsi="Times New Roman"/>
-          <w:b w:val="0"/>
-          <w:i/>
-          <w:sz w:val="24"/>
-        </w:rPr>
-        <w:t>N</w:t>
-      </w:r>
-      <w:r>
-        <w:rPr>
-          <w:rFonts w:ascii="Times New Roman" w:hAnsi="Times New Roman"/>
-          <w:b w:val="0"/>
-          <w:i w:val="0"/>
-          <w:sz w:val="24"/>
-        </w:rPr>
-        <w:t xml:space="preserve"> = 35; Demir-Lira et al., 2021, </w:t>
-      </w:r>
-      <w:r>
-        <w:rPr>
-          <w:rFonts w:ascii="Times New Roman" w:hAnsi="Times New Roman"/>
-          <w:b w:val="0"/>
-          <w:i/>
-          <w:sz w:val="24"/>
-        </w:rPr>
-        <w:t>N</w:t>
-      </w:r>
-      <w:r>
-        <w:rPr>
-          <w:rFonts w:ascii="Times New Roman" w:hAnsi="Times New Roman"/>
-          <w:b w:val="0"/>
-          <w:i w:val="0"/>
-          <w:sz w:val="24"/>
-        </w:rPr>
-        <w:t xml:space="preserve"> = 42), limiting statistical power and increasing the risk of inflated effect size estimates via winner's curse (Button et al., 2013). Future studies should target sample sizes of ≥100 in any single neural modality and ideally use pre-registered, adequately powered designs.</w:t>
+        <w:t>This convergence is theoretically coherent: language and executive function are the behavioral domains most consistently linked to parental education in behavioral and developmental studies (Hoff, 2013; Blair &amp; Raver, 2016), and the neural systems implicated here are the substrates of precisely those capacities. The cross-modal evidence thus provides a mechanistically coherent account of how parental education is translated from an environmental input into an outcome measurable at the behavioral level.</w:t>
       </w:r>
     </w:p>
     <w:p>
       <w:pPr>
+        <w:pStyle w:val="Heading2"/>
+        <w:spacing w:before="200" w:after="40" w:line="360" w:lineRule="auto"/>
+      </w:pPr>
+      <w:r>
+        <w:rPr>
+          <w:rFonts w:ascii="Times New Roman" w:hAnsi="Times New Roman"/>
+          <w:b/>
+          <w:sz w:val="26"/>
+        </w:rPr>
+        <w:t>4.5 Limitations and future directions</w:t>
+      </w:r>
+    </w:p>
+    <w:p>
+      <w:pPr>
         <w:jc w:val="left"/>
         <w:spacing w:before="0" w:after="120" w:line="480" w:lineRule="auto"/>
       </w:pPr>
@@ -7479,7 +8477,7 @@
           <w:i w:val="0"/>
           <w:sz w:val="24"/>
         </w:rPr>
-        <w:t>While all included studies controlled for at least some confounders, none controlled for the full set of variables that may co-vary with parental education and neural outcomes—including prenatal healthcare quality, gestational complications, postnatal nutrition, childcare quality, and the child's own emerging cognitive capacities. Residual confounding remains a plausible alternative explanation for some effect estimates.</w:t>
+        <w:t>Several limitations of the reviewed evidence base warrant explicit acknowledgment.</w:t>
       </w:r>
     </w:p>
     <w:p>
@@ -7494,7 +8492,7 @@
           <w:i w:val="0"/>
           <w:sz w:val="24"/>
         </w:rPr>
-        <w:t>The possibility of publication bias cannot be formally evaluated in the absence of a quantitative meta-analysis; funnel plot asymmetry tests and Egger's test are not applicable to narrative syntheses. However, the high proportion of positive findings (15 of 16 studies, 94%) may partly reflect selective publication of studies reporting significant associations between parental education and neural outcomes, as null findings in this literature are less likely to be submitted or accepted for publication. This risk is compounded by the restriction of the search to English-language databases, which may systematically under-represent null or negative findings published in other languages. The small sample sizes characteristic of neuroimaging studies further increase the risk of inflated effect size estimates in published work (Button et al., 2013). Readers should therefore interpret the observed directional consistency as suggestive of a genuine environmental signal, while acknowledging that the true proportion of null associations in the unpublished literature is unknown.</w:t>
+        <w:t>The most variable feature across studies was how parental education was measured. Across 16 studies, parental education was operationalized in at least six distinct ways (maternal years, paternal years, mean parental years, highest parental level, binary degree attainment, composite-separable). Notably, 14 of 16 studies relied primarily on maternal education; only two studies used highest-parental or combined-parental measures. The theoretical mechanisms proposed in this review—language input quality, caregiver sensitivity, stress buffering—differ systematically for maternal versus paternal education, and it remains unclear whether paternal education confers independent neural advantages beyond those associated with maternal education. Conclusions should therefore be read primarily as reflecting associations with maternal educational attainment. This heterogeneity also limits the precision of conclusions about dose–response relationships and makes it impossible to determine whether specific thresholds of educational attainment (e.g., university degree) confer qualitatively different advantages than incremental differences within lower educational levels.</w:t>
       </w:r>
     </w:p>
     <w:p>
@@ -7509,7 +8507,7 @@
           <w:i w:val="0"/>
           <w:sz w:val="24"/>
         </w:rPr>
-        <w:t>The requirement that parental education have an independently estimable regression coefficient introduces a form of selection bias that is distinct from publication bias. Studies in which parental education showed no independent association with neural outcomes are more likely to have operationalized education as part of a composite index without a separately reported coefficient—and thus be excluded under the E2 criterion. The 94% positive rate observed in this review may therefore partly reflect the structure of the inclusion criterion rather than solely the biological reality. This does not invalidate the findings, but readers should interpret the directional consistency with awareness that the reviewed evidence base is necessarily drawn from studies in which an independent education signal was sufficiently present to be modeled and reported.</w:t>
+        <w:t>No included study directly measured the hypothesized mediating variables alongside neural outcomes. As noted in Section 3.6, the mechanistic pathways proposed—cognitive stimulation and stress reduction—remain inferential from indirect evidence. Specifically designed studies coupling home language environment measurement (e.g., LENA recording; Gilkerson et al., 2017), caregiver stress biomarkers, and longitudinal neural assessment are needed to formally test the mechanistic chains.</w:t>
       </w:r>
     </w:p>
     <w:p>
@@ -7524,7 +8522,7 @@
           <w:i w:val="0"/>
           <w:sz w:val="24"/>
         </w:rPr>
-        <w:t>All included studies employed observational designs that cannot rule out genetic confounding via passive gene–environment correlation. Parental education is moderately heritable (~40%), and children of more educated parents inherit both genetic predispositions for cognitive development and enriched environments (Plomin et al., 2013; Selzam et al., 2020). None of the included studies used designs—such as monozygotic twin comparisons, adoption studies, or polygenic score-controlled analyses—that could disentangle genetic from environmental pathways. The observed neural associations may therefore partly reflect shared genetic variance between parent and child rather than purely environmental transmission. Future studies employing genetically informed designs would substantially strengthen causal inference.</w:t>
+        <w:t>Geographic and cultural concentration is a further limitation. Despite spanning 10 countries, the included studies are heavily concentrated in high-income Western contexts, particularly the United States, United Kingdom, and Canada (10 of 16 studies). Only one study (Wijeakumar et al., 2019) included a sample from a low- or middle-income country, and its cross-cultural design precluded direct inference about non-Western contexts in isolation. The systematic search was also restricted to English-language publications, further limiting coverage of research published in other languages, including Chinese, which would be essential for capturing the substantial and growing neurodevelopmental literature from China. The generalizability of findings to non-Western, non-English-speaking, and low-income country contexts is therefore unknown, and should not be assumed.</w:t>
       </w:r>
     </w:p>
     <w:p>
@@ -7539,11 +8537,140 @@
           <w:i w:val="0"/>
           <w:sz w:val="24"/>
         </w:rPr>
-        <w:t>Future research priorities identified by this review include: (1) neonatal and infant studies with prospective prenatal education assessment and direct biological pathway measurement (cortisol, language input); (2) studies in East Asian, South Asian, and sub-Saharan African samples with diverse educational systems; (3) multi-site, pre-registered longitudinal designs with sample sizes of ≥200 per wave (Knudsen et al., 2006); and (4) intervention studies—ideally randomized—examining whether parenting programmes targeting language enrichment or stress reduction in low-education families produce detectable changes in neural markers.</w:t>
+        <w:t xml:space="preserve">Several included studies had samples of fewer than 50 children (Stiver et al., 2015, </w:t>
+      </w:r>
+      <w:r>
+        <w:rPr>
+          <w:rFonts w:ascii="Times New Roman" w:hAnsi="Times New Roman"/>
+          <w:b w:val="0"/>
+          <w:i/>
+          <w:sz w:val="24"/>
+        </w:rPr>
+        <w:t>N</w:t>
+      </w:r>
+      <w:r>
+        <w:rPr>
+          <w:rFonts w:ascii="Times New Roman" w:hAnsi="Times New Roman"/>
+          <w:b w:val="0"/>
+          <w:i w:val="0"/>
+          <w:sz w:val="24"/>
+        </w:rPr>
+        <w:t xml:space="preserve"> = 26; Wijeakumar et al., 2019, </w:t>
+      </w:r>
+      <w:r>
+        <w:rPr>
+          <w:rFonts w:ascii="Times New Roman" w:hAnsi="Times New Roman"/>
+          <w:b w:val="0"/>
+          <w:i/>
+          <w:sz w:val="24"/>
+        </w:rPr>
+        <w:t>N</w:t>
+      </w:r>
+      <w:r>
+        <w:rPr>
+          <w:rFonts w:ascii="Times New Roman" w:hAnsi="Times New Roman"/>
+          <w:b w:val="0"/>
+          <w:i w:val="0"/>
+          <w:sz w:val="24"/>
+        </w:rPr>
+        <w:t xml:space="preserve"> = 35; Demir-Lira et al., 2021, </w:t>
+      </w:r>
+      <w:r>
+        <w:rPr>
+          <w:rFonts w:ascii="Times New Roman" w:hAnsi="Times New Roman"/>
+          <w:b w:val="0"/>
+          <w:i/>
+          <w:sz w:val="24"/>
+        </w:rPr>
+        <w:t>N</w:t>
+      </w:r>
+      <w:r>
+        <w:rPr>
+          <w:rFonts w:ascii="Times New Roman" w:hAnsi="Times New Roman"/>
+          <w:b w:val="0"/>
+          <w:i w:val="0"/>
+          <w:sz w:val="24"/>
+        </w:rPr>
+        <w:t xml:space="preserve"> = 42), limiting statistical power and increasing the risk of inflated effect size estimates via winner's curse (Button et al., 2013). Future studies should target sample sizes of ≥100 in any single neural modality and ideally use pre-registered, adequately powered designs.</w:t>
       </w:r>
     </w:p>
     <w:p>
       <w:pPr>
+        <w:jc w:val="left"/>
+        <w:spacing w:before="0" w:after="120" w:line="480" w:lineRule="auto"/>
+      </w:pPr>
+      <w:r>
+        <w:rPr>
+          <w:rFonts w:ascii="Times New Roman" w:hAnsi="Times New Roman"/>
+          <w:b w:val="0"/>
+          <w:i w:val="0"/>
+          <w:sz w:val="24"/>
+        </w:rPr>
+        <w:t>While all included studies controlled for at least some confounders, none controlled for the full set of variables that may co-vary with parental education and neural outcomes—including prenatal healthcare quality, gestational complications, postnatal nutrition, childcare quality, and the child's own emerging cognitive capacities. Residual confounding remains a plausible alternative explanation for some effect estimates.</w:t>
+      </w:r>
+    </w:p>
+    <w:p>
+      <w:pPr>
+        <w:jc w:val="left"/>
+        <w:spacing w:before="0" w:after="120" w:line="480" w:lineRule="auto"/>
+      </w:pPr>
+      <w:r>
+        <w:rPr>
+          <w:rFonts w:ascii="Times New Roman" w:hAnsi="Times New Roman"/>
+          <w:b w:val="0"/>
+          <w:i w:val="0"/>
+          <w:sz w:val="24"/>
+        </w:rPr>
+        <w:t>The possibility of publication bias cannot be formally evaluated in the absence of a quantitative meta-analysis; funnel plot asymmetry tests and Egger's test are not applicable to narrative syntheses. However, the high proportion of positive findings (15 of 16 studies, 94%) may partly reflect selective publication of studies reporting significant associations between parental education and neural outcomes, as null findings in this literature are less likely to be submitted or accepted for publication. This risk is compounded by the restriction of the search to English-language databases, which may systematically under-represent null or negative findings published in other languages. The small sample sizes characteristic of neuroimaging studies further increase the risk of inflated effect size estimates in published work (Button et al., 2013). Readers should therefore interpret the observed directional consistency as suggestive of a genuine environmental signal, while acknowledging that the true proportion of null associations in the unpublished literature is unknown.</w:t>
+      </w:r>
+    </w:p>
+    <w:p>
+      <w:pPr>
+        <w:jc w:val="left"/>
+        <w:spacing w:before="0" w:after="120" w:line="480" w:lineRule="auto"/>
+      </w:pPr>
+      <w:r>
+        <w:rPr>
+          <w:rFonts w:ascii="Times New Roman" w:hAnsi="Times New Roman"/>
+          <w:b w:val="0"/>
+          <w:i w:val="0"/>
+          <w:sz w:val="24"/>
+        </w:rPr>
+        <w:t>The requirement that parental education have an independently estimable regression coefficient introduces a form of selection bias that is distinct from publication bias. Studies in which parental education showed no independent association with neural outcomes are more likely to have operationalized education as part of a composite index without a separately reported coefficient—and thus be excluded under the E2 criterion. The 94% positive rate observed in this review may therefore partly reflect the structure of the inclusion criterion rather than solely the biological reality. This does not invalidate the findings, but readers should interpret the directional consistency with awareness that the reviewed evidence base is necessarily drawn from studies in which an independent education signal was sufficiently present to be modeled and reported.</w:t>
+      </w:r>
+    </w:p>
+    <w:p>
+      <w:pPr>
+        <w:jc w:val="left"/>
+        <w:spacing w:before="0" w:after="120" w:line="480" w:lineRule="auto"/>
+      </w:pPr>
+      <w:r>
+        <w:rPr>
+          <w:rFonts w:ascii="Times New Roman" w:hAnsi="Times New Roman"/>
+          <w:b w:val="0"/>
+          <w:i w:val="0"/>
+          <w:sz w:val="24"/>
+        </w:rPr>
+        <w:t>All included studies employed observational designs that cannot rule out genetic confounding via passive gene–environment correlation. Parental education is moderately heritable (~40%), and children of more educated parents inherit both genetic predispositions for cognitive development and enriched environments (Plomin et al., 2013; Selzam et al., 2020). None of the included studies used designs—such as monozygotic twin comparisons, adoption studies, or polygenic score-controlled analyses—that could disentangle genetic from environmental pathways. The observed neural associations may therefore partly reflect shared genetic variance between parent and child rather than purely environmental transmission. Future studies employing genetically informed designs would substantially strengthen causal inference.</w:t>
+      </w:r>
+    </w:p>
+    <w:p>
+      <w:pPr>
+        <w:jc w:val="left"/>
+        <w:spacing w:before="0" w:after="120" w:line="480" w:lineRule="auto"/>
+      </w:pPr>
+      <w:r>
+        <w:rPr>
+          <w:rFonts w:ascii="Times New Roman" w:hAnsi="Times New Roman"/>
+          <w:b w:val="0"/>
+          <w:i w:val="0"/>
+          <w:sz w:val="24"/>
+        </w:rPr>
+        <w:t>Future research priorities identified by this review include: (1) neonatal and infant studies with prospective prenatal education assessment and direct biological pathway measurement (cortisol, language input); (2) studies in East Asian, South Asian, and sub-Saharan African samples with diverse educational systems; (3) multi-site, pre-registered longitudinal designs with sample sizes of ≥200 per wave (Knudsen et al., 2006); and (4) intervention studies—ideally randomized—examining whether parenting programmes targeting language enrichment or stress reduction in low-education families produce detectable changes in neural markers.</w:t>
+      </w:r>
+    </w:p>
+    <w:p>
+      <w:pPr>
         <w:pStyle w:val="Heading2"/>
         <w:spacing w:before="200" w:after="40" w:line="360" w:lineRule="auto"/>
       </w:pPr>
@@ -7553,7 +8680,7 @@
           <w:b/>
           <w:sz w:val="26"/>
         </w:rPr>
-        <w:t>4.5 Conclusions</w:t>
+        <w:t>4.6 Conclusions</w:t>
       </w:r>
     </w:p>
     <w:p>

</xml_diff>